<commit_message>
John Travolta: revisão da Parte 1
Co-Authored-By: Claude Opus 5.5 <noreply@anthropic.com>
Claude-Session: https://claude.ai/code/session_01MJjUEEZrxQDEUifKK2vj9g
</commit_message>
<xml_diff>
--- a/roteiros/john-travolta/Travolta_Parte1.docx
+++ b/roteiros/john-travolta/Travolta_Parte1.docx
@@ -167,15 +167,7 @@
         <w:rPr>
           <w:color w:val="000000"/>
         </w:rPr>
-        <w:t>O menino John era o mais novo da casa e o mais agitado.</w:t>
-      </w:r>
-    </w:p>
-    <w:p>
-      <w:r>
-        <w:rPr>
-          <w:color w:val="000000"/>
-        </w:rPr>
-        <w:t>Cresceu vendo os irmãos mais velhos no palco, com a mãe ensaiando cada um deles.</w:t>
+        <w:t>O caçula cresceu vendo os irmãos mais velhos subirem ao palco, um depois do outro.</w:t>
       </w:r>
     </w:p>
     <w:p>
@@ -223,7 +215,7 @@
         <w:rPr>
           <w:color w:val="C00000"/>
         </w:rPr>
-        <w:t>Pense nisso por um segundo. Um garoto de dezessete anos, sem diploma e sem dinheiro, numa das cidades mais duras do mundo. Ninguém ali sabia o nome dele. Em menos de seis anos, o planeta inteiro ia saber. Mas o preço daquela fama ia ser cobrado das pessoas que ele mais amava.</w:t>
+        <w:t>Pense nisso por um segundo. Um garoto de dezessete anos, sem diploma e sem dinheiro, numa das cidades mais duras do mundo. Ninguém ali sabia o nome dele. Seis anos depois, o planeta inteiro ia saber. Mas o preço daquela fama ia ser cobrado das pessoas que ele mais amava.</w:t>
       </w:r>
     </w:p>
     <w:p>
@@ -231,7 +223,7 @@
         <w:rPr>
           <w:color w:val="000000"/>
         </w:rPr>
-        <w:t>Os primeiros anos foram de testes, papéis pequenos e muitos nãos.</w:t>
+        <w:t>Os primeiros anos foram de testes e de muitos nãos.</w:t>
       </w:r>
     </w:p>
     <w:p>
@@ -399,7 +391,7 @@
         <w:rPr>
           <w:color w:val="C00000"/>
         </w:rPr>
-        <w:t>Porque aquela mulher, que fazia o papel da mãe dele na ficção, ia virar o primeiro grande amor da vida de John Travolta. E, menos de um ano depois, ia morrer nos braços dele, poucos meses antes de o mundo inteiro descobrir o nome do rapaz.</w:t>
+        <w:t>Porque aquela mulher, que fazia o papel da mãe dele na ficção, ia virar o primeiro grande amor da vida de John Travolta. E o que aconteceu com ela, menos de um ano depois, ia marcar aquele rapaz para o resto da vida.</w:t>
       </w:r>
     </w:p>
     <w:sectPr>

</xml_diff>